<commit_message>
Record session prerequisite merge and verified Vercel delivery
</commit_message>
<xml_diff>
--- a/docs/reports/2026-10-16-session-step-up.docx
+++ b/docs/reports/2026-10-16-session-step-up.docx
@@ -718,6 +718,39 @@
           </w:p>
         </w:tc>
       </w:tr>
+      <w:tr>
+        <w:trPr>
+          <w:cantSplit/>
+        </w:trPr>
+        <w:tc>
+          <w:tcPr>
+            <w:tcW w:type="dxa" w:w="3300"/>
+            <w:vAlign w:val="center"/>
+          </w:tcPr>
+          <w:p>
+            <w:pPr>
+              <w:pStyle w:val="ReportTableText"/>
+            </w:pPr>
+            <w:r>
+              <w:t>Vercel exact source / public smoke</w:t>
+            </w:r>
+          </w:p>
+        </w:tc>
+        <w:tc>
+          <w:tcPr>
+            <w:tcW w:type="dxa" w:w="6060"/>
+            <w:vAlign w:val="center"/>
+          </w:tcPr>
+          <w:p>
+            <w:pPr>
+              <w:pStyle w:val="ReportTableText"/>
+            </w:pPr>
+            <w:r>
+              <w:t>Source 3fae18a Ready; all twenty fresh public-page/image/health/guest-denial checks pass at 05:15 UTC</w:t>
+            </w:r>
+          </w:p>
+        </w:tc>
+      </w:tr>
     </w:tbl>
     <w:p>
       <w:pPr>
@@ -782,7 +815,12 @@
     </w:p>
     <w:p>
       <w:r>
-        <w:t>Source review, commit/push, main merge and exact-source Vercel verification are pending at initial report generation. Deployment URLs and smoke results will be recorded only after observation. A hosted source build does not apply SQL or establish genuine Auth/MFA. No phase is complete.</w:t>
+        <w:t>Source commit 3fae18a6e0457a242e70466269930f30963e8330 is committed and pushed on codex/phase-1-session-step-up, then fast-forward merged and pushed to main. Independent git ls-remote confirms the same source on both remote branches. Eighteen reviewed source/test/report files were staged explicitly; staged diff validation passes and the user next-env edit remains unstaged. A transient Git sandbox denial was resolved through the approved command path; no force push or unrelated work removal occurred.</w:t>
+      </w:r>
+    </w:p>
+    <w:p>
+      <w:r>
+        <w:t>Vercel's read-only deployment API confirms that exact source on main READY in Production, deployment dpl_Druki4V3afe5cx9Vs2GD96cZN9jZ: https://virtual-bfa5iqvsx-shadowrootsec-5679.vercel.app. The alias https://virtual-ink.vercel.app resolves to that deployment. At 2026-10-16T05:15:34.461Z, after that source became Ready, all twenty fresh public-page/image/health/guest-denial smoke checks pass. These are regressions, not genuine MFA or privileged-role acceptance. A post-deployment hosted catalog read still shows ten migrations and no assignment schema/reader. A hosted source build does not apply SQL or establish genuine Auth/MFA. No phase is complete. This handover's final delivery evidence is recorded in a separate report commit.</w:t>
       </w:r>
     </w:p>
     <w:p>
@@ -843,7 +881,7 @@
     </w:p>
     <w:p>
       <w:r>
-        <w:t>Word uses the established compact_reference_guide preset, memo_masthead and named report-style overrides. Structural document checks pass. Rendering was attempted and failed because LibreOffice is absent (WinError 2); visual pagination remains unverified. Report evidence, local links, OOXML and privacy are checked separately. Report delivery is not human signoff.</w:t>
+        <w:t>Word uses the established compact_reference_guide preset, memo_masthead and named report-style overrides. Structural document checks pass. Rendering was attempted and failed because LibreOffice is absent (WinError 2); visual pagination remains unverified. All 211 local links, report evidence, OOXML and privacy checks pass. Report delivery is not human signoff.</w:t>
       </w:r>
     </w:p>
     <w:sectPr>

</xml_diff>